<commit_message>
formatting footer and header in the word template
</commit_message>
<xml_diff>
--- a/sector_report_agent/app/template.docx
+++ b/sector_report_agent/app/template.docx
@@ -6,7 +6,7 @@
       <w:headerReference w:type="default" r:id="rId9"/>
       <w:footerReference w:type="default" r:id="rId10"/>
       <w:pgSz w:w="11906" w:h="16838"/>
-      <w:pgMar w:top="1247" w:right="850" w:bottom="1134" w:left="850" w:header="567" w:footer="567" w:gutter="0"/>
+      <w:pgMar w:top="1247" w:right="850" w:bottom="1134" w:left="850" w:header="567" w:footer="454" w:gutter="0"/>
       <w:cols w:space="720"/>
       <w:docGrid w:linePitch="360"/>
     </w:sectPr>
@@ -18,16 +18,76 @@
 <w:ftr xmlns:m="http://schemas.openxmlformats.org/officeDocument/2006/math" xmlns:mc="http://schemas.openxmlformats.org/markup-compatibility/2006" xmlns:mo="http://schemas.microsoft.com/office/mac/office/2008/main" xmlns:mv="urn:schemas-microsoft-com:mac:vml" xmlns:o="urn:schemas-microsoft-com:office:office" xmlns:r="http://schemas.openxmlformats.org/officeDocument/2006/relationships" xmlns:v="urn:schemas-microsoft-com:vml" xmlns:w10="urn:schemas-microsoft-com:office:word" xmlns:w14="http://schemas.microsoft.com/office/word/2010/wordml" xmlns:w="http://schemas.openxmlformats.org/wordprocessingml/2006/main" xmlns:wne="http://schemas.microsoft.com/office/word/2006/wordml" xmlns:wp14="http://schemas.microsoft.com/office/word/2010/wordprocessingDrawing" xmlns:wp="http://schemas.openxmlformats.org/drawingml/2006/wordprocessingDrawing" xmlns:wpc="http://schemas.microsoft.com/office/word/2010/wordprocessingCanvas" xmlns:wpg="http://schemas.microsoft.com/office/word/2010/wordprocessingGroup" xmlns:wpi="http://schemas.microsoft.com/office/word/2010/wordprocessingInk" xmlns:wps="http://schemas.microsoft.com/office/word/2010/wordprocessingShape" mc:Ignorable="w14 wp14">
   <w:p>
     <w:pPr>
-      <w:pStyle w:val="Footer"/>
+      <w:jc w:val="left"/>
+      <w:spacing w:before="0" w:after="120" w:line="20" w:lineRule="exact"/>
+      <w:pBdr>
+        <w:bottom w:val="single" w:sz="4" w:space="0" w:color="8F8F8F"/>
+      </w:pBdr>
+    </w:pPr>
+    <w:r>
+      <w:rPr>
+        <w:sz w:val="4"/>
+      </w:rPr>
+    </w:r>
+  </w:p>
+  <w:p>
+    <w:pPr>
       <w:jc w:val="center"/>
+      <w:spacing w:before="60" w:after="0"/>
     </w:pPr>
     <w:r>
       <w:rPr>
         <w:rFonts w:ascii="Franklin Gothic Book" w:hAnsi="Franklin Gothic Book"/>
-        <w:color w:val="8F8F8F"/>
-        <w:sz w:val="16"/>
-      </w:rPr>
-      <w:t>{{COMPANY_NAME}}</w:t>
+        <w:smallCaps/>
+        <w:color w:val="333333"/>
+        <w:sz w:val="20"/>
+      </w:rPr>
+      <w:t>Ekonomické a Strategické Analýzy</w:t>
+    </w:r>
+    <w:r>
+      <w:drawing>
+        <wp:anchor xmlns:a="http://schemas.openxmlformats.org/drawingml/2006/main" xmlns:pic="http://schemas.openxmlformats.org/drawingml/2006/picture" distT="0" distB="0" distL="114300" distR="114300" simplePos="0" relativeHeight="251658240" behindDoc="0" locked="0" layoutInCell="1" allowOverlap="1">
+          <wp:simplePos x="0" y="0"/>
+          <wp:positionH relativeFrom="margin">
+            <wp:align>right</wp:align>
+          </wp:positionH>
+          <wp:positionV relativeFrom="paragraph">
+            <wp:posOffset>-75600</wp:posOffset>
+          </wp:positionV>
+          <wp:extent cx="788400" cy="356400"/>
+          <wp:effectExtent l="0" t="0" r="0" b="0"/>
+          <wp:wrapNone/>
+          <wp:docPr id="1" name="Logo"/>
+          <wp:cNvGraphicFramePr>
+            <a:graphicFrameLocks noChangeAspect="1"/>
+          </wp:cNvGraphicFramePr>
+          <a:graphic>
+            <a:graphicData uri="http://schemas.openxmlformats.org/drawingml/2006/picture">
+              <pic:pic>
+                <pic:nvPicPr>
+                  <pic:cNvPr id="0" name="csas.png"/>
+                  <pic:cNvPicPr/>
+                </pic:nvPicPr>
+                <pic:blipFill>
+                  <a:blip r:embed="rId1"/>
+                  <a:stretch>
+                    <a:fillRect/>
+                  </a:stretch>
+                </pic:blipFill>
+                <pic:spPr>
+                  <a:xfrm>
+                    <a:off x="0" y="0"/>
+                    <a:ext cx="788400" cy="356400"/>
+                  </a:xfrm>
+                  <a:prstGeom prst="rect">
+                    <a:avLst/>
+                  </a:prstGeom>
+                </pic:spPr>
+              </pic:pic>
+            </a:graphicData>
+          </a:graphic>
+        </wp:anchor>
+      </w:drawing>
     </w:r>
   </w:p>
 </w:ftr>
@@ -37,15 +97,19 @@
 <w:hdr xmlns:m="http://schemas.openxmlformats.org/officeDocument/2006/math" xmlns:mc="http://schemas.openxmlformats.org/markup-compatibility/2006" xmlns:mo="http://schemas.microsoft.com/office/mac/office/2008/main" xmlns:mv="urn:schemas-microsoft-com:mac:vml" xmlns:o="urn:schemas-microsoft-com:office:office" xmlns:r="http://schemas.openxmlformats.org/officeDocument/2006/relationships" xmlns:v="urn:schemas-microsoft-com:vml" xmlns:w10="urn:schemas-microsoft-com:office:word" xmlns:w14="http://schemas.microsoft.com/office/word/2010/wordml" xmlns:w="http://schemas.openxmlformats.org/wordprocessingml/2006/main" xmlns:wne="http://schemas.microsoft.com/office/word/2006/wordml" xmlns:wp14="http://schemas.microsoft.com/office/word/2010/wordprocessingDrawing" xmlns:wp="http://schemas.openxmlformats.org/drawingml/2006/wordprocessingDrawing" xmlns:wpc="http://schemas.microsoft.com/office/word/2010/wordprocessingCanvas" xmlns:wpg="http://schemas.microsoft.com/office/word/2010/wordprocessingGroup" xmlns:wpi="http://schemas.microsoft.com/office/word/2010/wordprocessingInk" xmlns:wps="http://schemas.microsoft.com/office/word/2010/wordprocessingShape" mc:Ignorable="w14 wp14">
   <w:p>
     <w:pPr>
-      <w:pStyle w:val="Header"/>
       <w:jc w:val="left"/>
+      <w:tabs>
+        <w:tab w:val="right" w:pos="10206"/>
+      </w:tabs>
+      <w:spacing w:before="0" w:after="120"/>
       <w:pBdr>
-        <w:bottom w:val="single" w:sz="4" w:space="1" w:color="8F8F8F"/>
+        <w:bottom w:val="single" w:sz="4" w:space="6" w:color="8F8F8F"/>
       </w:pBdr>
     </w:pPr>
     <w:r>
       <w:rPr>
         <w:rFonts w:ascii="Franklin Gothic Book" w:hAnsi="Franklin Gothic Book"/>
+        <w:smallCaps/>
         <w:color w:val="8F8F8F"/>
         <w:sz w:val="20"/>
       </w:rPr>
@@ -53,14 +117,11 @@
     </w:r>
     <w:r>
       <w:tab/>
-      <w:tab/>
-      <w:tab/>
-      <w:tab/>
-      <w:tab/>
     </w:r>
     <w:r>
       <w:rPr>
         <w:rFonts w:ascii="Franklin Gothic Book" w:hAnsi="Franklin Gothic Book"/>
+        <w:smallCaps/>
         <w:color w:val="8F8F8F"/>
         <w:sz w:val="20"/>
       </w:rPr>
@@ -12134,7 +12195,6 @@
     <w:name w:val="Chart Title"/>
     <w:pPr>
       <w:spacing w:before="240" w:after="80"/>
-      <w:jc w:val="left"/>
     </w:pPr>
     <w:rPr>
       <w:rFonts w:ascii="Times New Roman" w:hAnsi="Times New Roman"/>
@@ -12146,7 +12206,6 @@
     <w:name w:val="Chart Source"/>
     <w:pPr>
       <w:spacing w:before="40" w:after="200"/>
-      <w:jc w:val="left"/>
     </w:pPr>
     <w:rPr>
       <w:rFonts w:ascii="Times New Roman" w:hAnsi="Times New Roman"/>

</xml_diff>

<commit_message>
adding content and page numbering to the word template
</commit_message>
<xml_diff>
--- a/sector_report_agent/app/template.docx
+++ b/sector_report_agent/app/template.docx
@@ -18,10 +18,9 @@
 <w:ftr xmlns:m="http://schemas.openxmlformats.org/officeDocument/2006/math" xmlns:mc="http://schemas.openxmlformats.org/markup-compatibility/2006" xmlns:mo="http://schemas.microsoft.com/office/mac/office/2008/main" xmlns:mv="urn:schemas-microsoft-com:mac:vml" xmlns:o="urn:schemas-microsoft-com:office:office" xmlns:r="http://schemas.openxmlformats.org/officeDocument/2006/relationships" xmlns:v="urn:schemas-microsoft-com:vml" xmlns:w10="urn:schemas-microsoft-com:office:word" xmlns:w14="http://schemas.microsoft.com/office/word/2010/wordml" xmlns:w="http://schemas.openxmlformats.org/wordprocessingml/2006/main" xmlns:wne="http://schemas.microsoft.com/office/word/2006/wordml" xmlns:wp14="http://schemas.microsoft.com/office/word/2010/wordprocessingDrawing" xmlns:wp="http://schemas.openxmlformats.org/drawingml/2006/wordprocessingDrawing" xmlns:wpc="http://schemas.microsoft.com/office/word/2010/wordprocessingCanvas" xmlns:wpg="http://schemas.microsoft.com/office/word/2010/wordprocessingGroup" xmlns:wpi="http://schemas.microsoft.com/office/word/2010/wordprocessingInk" xmlns:wps="http://schemas.microsoft.com/office/word/2010/wordprocessingShape" mc:Ignorable="w14 wp14">
   <w:p>
     <w:pPr>
-      <w:jc w:val="left"/>
-      <w:spacing w:before="0" w:after="120" w:line="20" w:lineRule="exact"/>
+      <w:spacing w:before="0" w:after="200" w:line="20" w:lineRule="exact"/>
       <w:pBdr>
-        <w:bottom w:val="single" w:sz="4" w:space="0" w:color="8F8F8F"/>
+        <w:bottom w:val="single" w:sz="4" w:space="0" w:color="666666"/>
       </w:pBdr>
     </w:pPr>
     <w:r>
@@ -32,15 +31,39 @@
   </w:p>
   <w:p>
     <w:pPr>
-      <w:jc w:val="center"/>
-      <w:spacing w:before="60" w:after="0"/>
+      <w:jc w:val="left"/>
+      <w:tabs>
+        <w:tab w:val="center" w:pos="5103"/>
+      </w:tabs>
+      <w:spacing w:before="0" w:after="0"/>
     </w:pPr>
     <w:r>
       <w:rPr>
+        <w:sz w:val="20"/>
+        <w:color w:val="666666"/>
+      </w:rPr>
+      <w:fldChar w:fldCharType="begin"/>
+    </w:r>
+    <w:r>
+      <w:rPr>
+        <w:sz w:val="20"/>
+        <w:color w:val="666666"/>
+      </w:rPr>
+      <w:instrText xml:space="preserve"> PAGE </w:instrText>
+    </w:r>
+    <w:r>
+      <w:fldChar w:fldCharType="end"/>
+    </w:r>
+    <w:r>
+      <w:tab/>
+    </w:r>
+    <w:r>
+      <w:rPr>
         <w:rFonts w:ascii="Franklin Gothic Book" w:hAnsi="Franklin Gothic Book"/>
+        <w:sz w:val="20"/>
+        <w:szCs w:val="20"/>
+        <w:color w:val="666666"/>
         <w:smallCaps/>
-        <w:color w:val="333333"/>
-        <w:sz w:val="20"/>
       </w:rPr>
       <w:t>Ekonomické a Strategické Analýzy</w:t>
     </w:r>
@@ -52,7 +75,7 @@
             <wp:align>right</wp:align>
           </wp:positionH>
           <wp:positionV relativeFrom="paragraph">
-            <wp:posOffset>-75600</wp:posOffset>
+            <wp:posOffset>-54000</wp:posOffset>
           </wp:positionV>
           <wp:extent cx="788400" cy="356400"/>
           <wp:effectExtent l="0" t="0" r="0" b="0"/>
@@ -101,17 +124,18 @@
       <w:tabs>
         <w:tab w:val="right" w:pos="10206"/>
       </w:tabs>
-      <w:spacing w:before="0" w:after="120"/>
+      <w:spacing w:before="0" w:after="0"/>
       <w:pBdr>
-        <w:bottom w:val="single" w:sz="4" w:space="6" w:color="8F8F8F"/>
+        <w:bottom w:val="single" w:sz="4" w:space="6" w:color="666666"/>
       </w:pBdr>
     </w:pPr>
     <w:r>
       <w:rPr>
         <w:rFonts w:ascii="Franklin Gothic Book" w:hAnsi="Franklin Gothic Book"/>
+        <w:sz w:val="20"/>
+        <w:szCs w:val="20"/>
+        <w:color w:val="666666"/>
         <w:smallCaps/>
-        <w:color w:val="8F8F8F"/>
-        <w:sz w:val="20"/>
       </w:rPr>
       <w:t>{{REPORT_TITLE}}</w:t>
     </w:r>
@@ -121,9 +145,10 @@
     <w:r>
       <w:rPr>
         <w:rFonts w:ascii="Franklin Gothic Book" w:hAnsi="Franklin Gothic Book"/>
+        <w:sz w:val="20"/>
+        <w:szCs w:val="20"/>
+        <w:color w:val="666666"/>
         <w:smallCaps/>
-        <w:color w:val="8F8F8F"/>
-        <w:sz w:val="20"/>
       </w:rPr>
       <w:t>{{REPORT_DATE}}</w:t>
     </w:r>
@@ -12190,6 +12215,18 @@
         <w:shd w:val="clear" w:color="auto" w:fill="FBCAA2" w:themeFill="accent6" w:themeFillTint="7F"/>
       </w:tcPr>
     </w:tblStylePr>
+  </w:style>
+  <w:style w:type="paragraph" w:customStyle="1" w:styleId="TOCHeadingCustom">
+    <w:name w:val="TOC Heading Custom"/>
+    <w:pPr>
+      <w:spacing w:before="240" w:after="240"/>
+    </w:pPr>
+    <w:rPr>
+      <w:rFonts w:ascii="Franklin Gothic Book" w:hAnsi="Franklin Gothic Book"/>
+      <w:b/>
+      <w:color w:val="245375"/>
+      <w:sz w:val="28"/>
+    </w:rPr>
   </w:style>
   <w:style w:type="paragraph" w:customStyle="1" w:styleId="ChartTitle">
     <w:name w:val="Chart Title"/>

</xml_diff>